<commit_message>
Episode_3: Does ChatGPT know or It Guesses
</commit_message>
<xml_diff>
--- a/AI/Episode_3/DoesChatGPTKnowOrItGuess.docx
+++ b/AI/Episode_3/DoesChatGPTKnowOrItGuess.docx
@@ -1,6 +1,6 @@
 
 <file path=word/document.xml><?xml version="1.0" encoding="utf-8"?>
-<w:document xmlns:wpc="http://schemas.microsoft.com/office/word/2010/wordprocessingCanvas" xmlns:cx="http://schemas.microsoft.com/office/drawing/2014/chartex" xmlns:cx1="http://schemas.microsoft.com/office/drawing/2015/9/8/chartex" xmlns:cx2="http://schemas.microsoft.com/office/drawing/2015/10/21/chartex" xmlns:cx3="http://schemas.microsoft.com/office/drawing/2016/5/9/chartex" xmlns:cx4="http://schemas.microsoft.com/office/drawing/2016/5/10/chartex" xmlns:cx5="http://schemas.microsoft.com/office/drawing/2016/5/11/chartex" xmlns:cx6="http://schemas.microsoft.com/office/drawing/2016/5/12/chartex" xmlns:cx7="http://schemas.microsoft.com/office/drawing/2016/5/13/chartex" xmlns:cx8="http://schemas.microsoft.com/office/drawing/2016/5/14/chartex" xmlns:mc="http://schemas.openxmlformats.org/markup-compatibility/2006" xmlns:aink="http://schemas.microsoft.com/office/drawing/2016/ink" xmlns:am3d="http://schemas.microsoft.com/office/drawing/2017/model3d" xmlns:o="urn:schemas-microsoft-com:office:office" xmlns:oel="http://schemas.microsoft.com/office/2019/extlst" xmlns:r="http://schemas.openxmlformats.org/officeDocument/2006/relationships" xmlns:m="http://schemas.openxmlformats.org/officeDocument/2006/math" xmlns:v="urn:schemas-microsoft-com:vml" xmlns:wp14="http://schemas.microsoft.com/office/word/2010/wordprocessingDrawing" xmlns:wp="http://schemas.openxmlformats.org/drawingml/2006/wordprocessingDrawing" xmlns:w10="urn:schemas-microsoft-com:office:word" xmlns:w="http://schemas.openxmlformats.org/wordprocessingml/2006/main" xmlns:w14="http://schemas.microsoft.com/office/word/2010/wordml" xmlns:w15="http://schemas.microsoft.com/office/word/2012/wordml" xmlns:w16cei="http://schemas.microsoft.com/office/word/2026/wordml/cei" xmlns:w16cex="http://schemas.microsoft.com/office/word/2018/wordml/cex" xmlns:w16cid="http://schemas.microsoft.com/office/word/2016/wordml/cid" xmlns:w16="http://schemas.microsoft.com/office/word/2018/wordml" xmlns:w16du="http://schemas.microsoft.com/office/word/2023/wordml/word16du" xmlns:w16sdtdh="http://schemas.microsoft.com/office/word/2020/wordml/sdtdatahash" xmlns:w16sdtfl="http://schemas.microsoft.com/office/word/2024/wordml/sdtformatlock" xmlns:w16se="http://schemas.microsoft.com/office/word/2015/wordml/symex" xmlns:wpg="http://schemas.microsoft.com/office/word/2010/wordprocessingGroup" xmlns:wpi="http://schemas.microsoft.com/office/word/2010/wordprocessingInk" xmlns:wne="http://schemas.microsoft.com/office/word/2006/wordml" xmlns:wps="http://schemas.microsoft.com/office/word/2010/wordprocessingShape" mc:Ignorable="w14 w15 w16se w16cid w16 w16cex w16sdtdh w16sdtfl w16du wp14">
+<w:document xmlns:wpc="http://schemas.microsoft.com/office/word/2010/wordprocessingCanvas" xmlns:cx="http://schemas.microsoft.com/office/drawing/2014/chartex" xmlns:cx1="http://schemas.microsoft.com/office/drawing/2015/9/8/chartex" xmlns:cx2="http://schemas.microsoft.com/office/drawing/2015/10/21/chartex" xmlns:cx3="http://schemas.microsoft.com/office/drawing/2016/5/9/chartex" xmlns:cx4="http://schemas.microsoft.com/office/drawing/2016/5/10/chartex" xmlns:cx5="http://schemas.microsoft.com/office/drawing/2016/5/11/chartex" xmlns:cx6="http://schemas.microsoft.com/office/drawing/2016/5/12/chartex" xmlns:cx7="http://schemas.microsoft.com/office/drawing/2016/5/13/chartex" xmlns:cx8="http://schemas.microsoft.com/office/drawing/2016/5/14/chartex" xmlns:mc="http://schemas.openxmlformats.org/markup-compatibility/2006" xmlns:aink="http://schemas.microsoft.com/office/drawing/2016/ink" xmlns:am3d="http://schemas.microsoft.com/office/drawing/2017/model3d" xmlns:o="urn:schemas-microsoft-com:office:office" xmlns:oel="http://schemas.microsoft.com/office/2019/extlst" xmlns:r="http://schemas.openxmlformats.org/officeDocument/2006/relationships" xmlns:m="http://schemas.openxmlformats.org/officeDocument/2006/math" xmlns:v="urn:schemas-microsoft-com:vml" xmlns:wp14="http://schemas.microsoft.com/office/word/2010/wordprocessingDrawing" xmlns:wp="http://schemas.openxmlformats.org/drawingml/2006/wordprocessingDrawing" xmlns:w10="urn:schemas-microsoft-com:office:word" xmlns:w="http://schemas.openxmlformats.org/wordprocessingml/2006/main" xmlns:w14="http://schemas.microsoft.com/office/word/2010/wordml" xmlns:w15="http://schemas.microsoft.com/office/word/2012/wordml" xmlns:w16cex="http://schemas.microsoft.com/office/word/2018/wordml/cex" xmlns:w16cid="http://schemas.microsoft.com/office/word/2016/wordml/cid" xmlns:w16="http://schemas.microsoft.com/office/word/2018/wordml" xmlns:w16du="http://schemas.microsoft.com/office/word/2023/wordml/word16du" xmlns:w16sdtdh="http://schemas.microsoft.com/office/word/2020/wordml/sdtdatahash" xmlns:w16sdtfl="http://schemas.microsoft.com/office/word/2024/wordml/sdtformatlock" xmlns:w16se="http://schemas.microsoft.com/office/word/2015/wordml/symex" xmlns:wpg="http://schemas.microsoft.com/office/word/2010/wordprocessingGroup" xmlns:wpi="http://schemas.microsoft.com/office/word/2010/wordprocessingInk" xmlns:wne="http://schemas.microsoft.com/office/word/2006/wordml" xmlns:wps="http://schemas.microsoft.com/office/word/2010/wordprocessingShape" mc:Ignorable="w14 w15 w16se w16cid w16 w16cex w16sdtdh w16sdtfl w16du wp14">
   <w:body>
     <w:p>
       <w:pPr>
@@ -225,6 +225,2167 @@
         </w:rPr>
         <w:t>Search engines retrieves information. LLMs generate responses.</w:t>
       </w:r>
+    </w:p>
+    <w:p>
+      <w:pPr>
+        <w:rPr>
+          <w:sz w:val="24"/>
+          <w:szCs w:val="24"/>
+          <w:lang w:val="en-US"/>
+        </w:rPr>
+      </w:pPr>
+    </w:p>
+    <w:p>
+      <w:pPr>
+        <w:pStyle w:val="ListParagraph"/>
+        <w:numPr>
+          <w:ilvl w:val="0"/>
+          <w:numId w:val="1"/>
+        </w:numPr>
+        <w:rPr>
+          <w:sz w:val="24"/>
+          <w:szCs w:val="24"/>
+          <w:lang w:val="en-US"/>
+        </w:rPr>
+      </w:pPr>
+      <w:r>
+        <w:rPr>
+          <w:sz w:val="24"/>
+          <w:szCs w:val="24"/>
+          <w:lang w:val="en-US"/>
+        </w:rPr>
+        <w:t>How search engines find information?</w:t>
+      </w:r>
+    </w:p>
+    <w:p>
+      <w:pPr>
+        <w:pStyle w:val="ListParagraph"/>
+        <w:rPr>
+          <w:sz w:val="24"/>
+          <w:szCs w:val="24"/>
+          <w:lang w:val="en-US"/>
+        </w:rPr>
+      </w:pPr>
+      <w:r>
+        <w:rPr>
+          <w:sz w:val="24"/>
+          <w:szCs w:val="24"/>
+          <w:lang w:val="en-US"/>
+        </w:rPr>
+        <w:t>Search engines returns ranked documents. The ranking is done on the basis of indexing. The indexing is done on the basis of credibility of the website, site engagement, and many other metrics like that.</w:t>
+      </w:r>
+    </w:p>
+    <w:p>
+      <w:pPr>
+        <w:rPr>
+          <w:sz w:val="24"/>
+          <w:szCs w:val="24"/>
+          <w:lang w:val="en-US"/>
+        </w:rPr>
+      </w:pPr>
+    </w:p>
+    <w:p>
+      <w:pPr>
+        <w:pStyle w:val="ListParagraph"/>
+        <w:numPr>
+          <w:ilvl w:val="0"/>
+          <w:numId w:val="1"/>
+        </w:numPr>
+        <w:rPr>
+          <w:sz w:val="24"/>
+          <w:szCs w:val="24"/>
+          <w:lang w:val="en-US"/>
+        </w:rPr>
+      </w:pPr>
+      <w:r>
+        <w:rPr>
+          <w:sz w:val="24"/>
+          <w:szCs w:val="24"/>
+          <w:lang w:val="en-US"/>
+        </w:rPr>
+        <w:t>How is Google creating the index for each of the websites?</w:t>
+      </w:r>
+    </w:p>
+    <w:p>
+      <w:pPr>
+        <w:pStyle w:val="ListParagraph"/>
+        <w:rPr>
+          <w:sz w:val="24"/>
+          <w:szCs w:val="24"/>
+          <w:lang w:val="en-US"/>
+        </w:rPr>
+      </w:pPr>
+      <w:r>
+        <w:rPr>
+          <w:sz w:val="24"/>
+          <w:szCs w:val="24"/>
+          <w:lang w:val="en-US"/>
+        </w:rPr>
+        <w:t xml:space="preserve">The crawlers/spiders which are basically bots keep on </w:t>
+      </w:r>
+      <w:r>
+        <w:rPr>
+          <w:sz w:val="24"/>
+          <w:szCs w:val="24"/>
+          <w:lang w:val="en-US"/>
+        </w:rPr>
+        <w:t xml:space="preserve">constantly </w:t>
+      </w:r>
+      <w:r>
+        <w:rPr>
+          <w:sz w:val="24"/>
+          <w:szCs w:val="24"/>
+          <w:lang w:val="en-US"/>
+        </w:rPr>
+        <w:t>searching the internet</w:t>
+      </w:r>
+      <w:r>
+        <w:rPr>
+          <w:sz w:val="24"/>
+          <w:szCs w:val="24"/>
+          <w:lang w:val="en-US"/>
+        </w:rPr>
+        <w:t xml:space="preserve"> for new information</w:t>
+      </w:r>
+      <w:r>
+        <w:rPr>
+          <w:sz w:val="24"/>
+          <w:szCs w:val="24"/>
+          <w:lang w:val="en-US"/>
+        </w:rPr>
+        <w:t>, and it keeps on updating the indexing live. When the index is updated, you keep on getting the new information.</w:t>
+      </w:r>
+    </w:p>
+    <w:p>
+      <w:pPr>
+        <w:rPr>
+          <w:sz w:val="24"/>
+          <w:szCs w:val="24"/>
+          <w:lang w:val="en-US"/>
+        </w:rPr>
+      </w:pPr>
+    </w:p>
+    <w:p>
+      <w:pPr>
+        <w:pStyle w:val="ListParagraph"/>
+        <w:numPr>
+          <w:ilvl w:val="0"/>
+          <w:numId w:val="1"/>
+        </w:numPr>
+        <w:rPr>
+          <w:sz w:val="24"/>
+          <w:szCs w:val="24"/>
+          <w:lang w:val="en-US"/>
+        </w:rPr>
+      </w:pPr>
+      <w:r>
+        <w:rPr>
+          <w:sz w:val="24"/>
+          <w:szCs w:val="24"/>
+          <w:lang w:val="en-US"/>
+        </w:rPr>
+        <w:t>How are documents ranked?</w:t>
+      </w:r>
+    </w:p>
+    <w:p>
+      <w:pPr>
+        <w:pStyle w:val="ListParagraph"/>
+        <w:numPr>
+          <w:ilvl w:val="0"/>
+          <w:numId w:val="2"/>
+        </w:numPr>
+        <w:rPr>
+          <w:sz w:val="24"/>
+          <w:szCs w:val="24"/>
+          <w:lang w:val="en-US"/>
+        </w:rPr>
+      </w:pPr>
+      <w:r>
+        <w:rPr>
+          <w:sz w:val="24"/>
+          <w:szCs w:val="24"/>
+          <w:lang w:val="en-US"/>
+        </w:rPr>
+        <w:t>Domain authority</w:t>
+      </w:r>
+    </w:p>
+    <w:p>
+      <w:pPr>
+        <w:pStyle w:val="ListParagraph"/>
+        <w:numPr>
+          <w:ilvl w:val="0"/>
+          <w:numId w:val="2"/>
+        </w:numPr>
+        <w:rPr>
+          <w:sz w:val="24"/>
+          <w:szCs w:val="24"/>
+          <w:lang w:val="en-US"/>
+        </w:rPr>
+      </w:pPr>
+      <w:r>
+        <w:rPr>
+          <w:sz w:val="24"/>
+          <w:szCs w:val="24"/>
+          <w:lang w:val="en-US"/>
+        </w:rPr>
+        <w:t>Page speed</w:t>
+      </w:r>
+    </w:p>
+    <w:p>
+      <w:pPr>
+        <w:pStyle w:val="ListParagraph"/>
+        <w:numPr>
+          <w:ilvl w:val="0"/>
+          <w:numId w:val="2"/>
+        </w:numPr>
+        <w:rPr>
+          <w:sz w:val="24"/>
+          <w:szCs w:val="24"/>
+          <w:lang w:val="en-US"/>
+        </w:rPr>
+      </w:pPr>
+      <w:r>
+        <w:rPr>
+          <w:sz w:val="24"/>
+          <w:szCs w:val="24"/>
+          <w:lang w:val="en-US"/>
+        </w:rPr>
+        <w:t>Keywords</w:t>
+      </w:r>
+    </w:p>
+    <w:p>
+      <w:pPr>
+        <w:pStyle w:val="ListParagraph"/>
+        <w:numPr>
+          <w:ilvl w:val="0"/>
+          <w:numId w:val="2"/>
+        </w:numPr>
+        <w:rPr>
+          <w:sz w:val="24"/>
+          <w:szCs w:val="24"/>
+          <w:lang w:val="en-US"/>
+        </w:rPr>
+      </w:pPr>
+      <w:r>
+        <w:rPr>
+          <w:sz w:val="24"/>
+          <w:szCs w:val="24"/>
+          <w:lang w:val="en-US"/>
+        </w:rPr>
+        <w:t>Avg. spent time</w:t>
+      </w:r>
+    </w:p>
+    <w:p>
+      <w:pPr>
+        <w:pStyle w:val="ListParagraph"/>
+        <w:numPr>
+          <w:ilvl w:val="0"/>
+          <w:numId w:val="2"/>
+        </w:numPr>
+        <w:rPr>
+          <w:sz w:val="24"/>
+          <w:szCs w:val="24"/>
+          <w:lang w:val="en-US"/>
+        </w:rPr>
+      </w:pPr>
+      <w:r>
+        <w:rPr>
+          <w:sz w:val="24"/>
+          <w:szCs w:val="24"/>
+          <w:lang w:val="en-US"/>
+        </w:rPr>
+        <w:t>Backlinks</w:t>
+      </w:r>
+    </w:p>
+    <w:p>
+      <w:pPr>
+        <w:pStyle w:val="ListParagraph"/>
+        <w:numPr>
+          <w:ilvl w:val="0"/>
+          <w:numId w:val="2"/>
+        </w:numPr>
+        <w:rPr>
+          <w:sz w:val="24"/>
+          <w:szCs w:val="24"/>
+          <w:lang w:val="en-US"/>
+        </w:rPr>
+      </w:pPr>
+      <w:r>
+        <w:rPr>
+          <w:sz w:val="24"/>
+          <w:szCs w:val="24"/>
+          <w:lang w:val="en-US"/>
+        </w:rPr>
+        <w:t>Meta tags</w:t>
+      </w:r>
+    </w:p>
+    <w:p>
+      <w:pPr>
+        <w:pStyle w:val="ListParagraph"/>
+        <w:numPr>
+          <w:ilvl w:val="0"/>
+          <w:numId w:val="2"/>
+        </w:numPr>
+        <w:rPr>
+          <w:sz w:val="24"/>
+          <w:szCs w:val="24"/>
+          <w:lang w:val="en-US"/>
+        </w:rPr>
+      </w:pPr>
+      <w:r>
+        <w:rPr>
+          <w:sz w:val="24"/>
+          <w:szCs w:val="24"/>
+          <w:lang w:val="en-US"/>
+        </w:rPr>
+        <w:t>Date of publishing</w:t>
+      </w:r>
+    </w:p>
+    <w:p>
+      <w:pPr>
+        <w:rPr>
+          <w:sz w:val="24"/>
+          <w:szCs w:val="24"/>
+          <w:lang w:val="en-US"/>
+        </w:rPr>
+      </w:pPr>
+    </w:p>
+    <w:p>
+      <w:pPr>
+        <w:pStyle w:val="ListParagraph"/>
+        <w:numPr>
+          <w:ilvl w:val="0"/>
+          <w:numId w:val="1"/>
+        </w:numPr>
+        <w:rPr>
+          <w:sz w:val="24"/>
+          <w:szCs w:val="24"/>
+          <w:lang w:val="en-US"/>
+        </w:rPr>
+      </w:pPr>
+      <w:r>
+        <w:rPr>
+          <w:sz w:val="24"/>
+          <w:szCs w:val="24"/>
+          <w:lang w:val="en-US"/>
+        </w:rPr>
+        <w:t>Cons of search engines:</w:t>
+      </w:r>
+    </w:p>
+    <w:p>
+      <w:pPr>
+        <w:pStyle w:val="ListParagraph"/>
+        <w:numPr>
+          <w:ilvl w:val="1"/>
+          <w:numId w:val="1"/>
+        </w:numPr>
+        <w:rPr>
+          <w:sz w:val="24"/>
+          <w:szCs w:val="24"/>
+          <w:lang w:val="en-US"/>
+        </w:rPr>
+      </w:pPr>
+      <w:r>
+        <w:rPr>
+          <w:sz w:val="24"/>
+          <w:szCs w:val="24"/>
+          <w:lang w:val="en-US"/>
+        </w:rPr>
+        <w:t>Does not guarantee truth</w:t>
+      </w:r>
+    </w:p>
+    <w:p>
+      <w:pPr>
+        <w:pStyle w:val="ListParagraph"/>
+        <w:numPr>
+          <w:ilvl w:val="1"/>
+          <w:numId w:val="1"/>
+        </w:numPr>
+        <w:rPr>
+          <w:sz w:val="24"/>
+          <w:szCs w:val="24"/>
+          <w:lang w:val="en-US"/>
+        </w:rPr>
+      </w:pPr>
+      <w:r>
+        <w:rPr>
+          <w:sz w:val="24"/>
+          <w:szCs w:val="24"/>
+          <w:lang w:val="en-US"/>
+        </w:rPr>
+        <w:t>Rankings can be imperfect</w:t>
+      </w:r>
+    </w:p>
+    <w:p>
+      <w:pPr>
+        <w:pStyle w:val="ListParagraph"/>
+        <w:numPr>
+          <w:ilvl w:val="1"/>
+          <w:numId w:val="1"/>
+        </w:numPr>
+        <w:rPr>
+          <w:sz w:val="24"/>
+          <w:szCs w:val="24"/>
+          <w:lang w:val="en-US"/>
+        </w:rPr>
+      </w:pPr>
+      <w:r>
+        <w:rPr>
+          <w:sz w:val="24"/>
+          <w:szCs w:val="24"/>
+          <w:lang w:val="en-US"/>
+        </w:rPr>
+        <w:t>Info can be misleading</w:t>
+      </w:r>
+    </w:p>
+    <w:p>
+      <w:pPr>
+        <w:pStyle w:val="ListParagraph"/>
+        <w:numPr>
+          <w:ilvl w:val="1"/>
+          <w:numId w:val="1"/>
+        </w:numPr>
+        <w:rPr>
+          <w:sz w:val="24"/>
+          <w:szCs w:val="24"/>
+          <w:lang w:val="en-US"/>
+        </w:rPr>
+      </w:pPr>
+      <w:r>
+        <w:rPr>
+          <w:sz w:val="24"/>
+          <w:szCs w:val="24"/>
+          <w:lang w:val="en-US"/>
+        </w:rPr>
+        <w:t>Can be outda</w:t>
+      </w:r>
+      <w:r>
+        <w:rPr>
+          <w:sz w:val="24"/>
+          <w:szCs w:val="24"/>
+          <w:lang w:val="en-US"/>
+        </w:rPr>
+        <w:t>t</w:t>
+      </w:r>
+      <w:r>
+        <w:rPr>
+          <w:sz w:val="24"/>
+          <w:szCs w:val="24"/>
+          <w:lang w:val="en-US"/>
+        </w:rPr>
+        <w:t>ed</w:t>
+      </w:r>
+    </w:p>
+    <w:p>
+      <w:pPr>
+        <w:ind w:left="720"/>
+        <w:rPr>
+          <w:sz w:val="24"/>
+          <w:szCs w:val="24"/>
+          <w:lang w:val="en-US"/>
+        </w:rPr>
+      </w:pPr>
+      <w:r>
+        <w:rPr>
+          <w:sz w:val="24"/>
+          <w:szCs w:val="24"/>
+          <w:lang w:val="en-US"/>
+        </w:rPr>
+        <w:t>Pros of search engines:</w:t>
+      </w:r>
+    </w:p>
+    <w:p>
+      <w:pPr>
+        <w:pStyle w:val="ListParagraph"/>
+        <w:numPr>
+          <w:ilvl w:val="0"/>
+          <w:numId w:val="3"/>
+        </w:numPr>
+        <w:rPr>
+          <w:sz w:val="24"/>
+          <w:szCs w:val="24"/>
+          <w:lang w:val="en-US"/>
+        </w:rPr>
+      </w:pPr>
+      <w:r>
+        <w:rPr>
+          <w:sz w:val="24"/>
+          <w:szCs w:val="24"/>
+          <w:lang w:val="en-US"/>
+        </w:rPr>
+        <w:t>A trail back to source</w:t>
+      </w:r>
+    </w:p>
+    <w:p>
+      <w:pPr>
+        <w:pStyle w:val="ListParagraph"/>
+        <w:numPr>
+          <w:ilvl w:val="0"/>
+          <w:numId w:val="3"/>
+        </w:numPr>
+        <w:rPr>
+          <w:sz w:val="24"/>
+          <w:szCs w:val="24"/>
+          <w:lang w:val="en-US"/>
+        </w:rPr>
+      </w:pPr>
+      <w:r>
+        <w:rPr>
+          <w:sz w:val="24"/>
+          <w:szCs w:val="24"/>
+          <w:lang w:val="en-US"/>
+        </w:rPr>
+        <w:t>Check who published it</w:t>
+      </w:r>
+    </w:p>
+    <w:p>
+      <w:pPr>
+        <w:pStyle w:val="ListParagraph"/>
+        <w:numPr>
+          <w:ilvl w:val="0"/>
+          <w:numId w:val="3"/>
+        </w:numPr>
+        <w:rPr>
+          <w:sz w:val="24"/>
+          <w:szCs w:val="24"/>
+          <w:lang w:val="en-US"/>
+        </w:rPr>
+      </w:pPr>
+      <w:r>
+        <w:rPr>
+          <w:sz w:val="24"/>
+          <w:szCs w:val="24"/>
+          <w:lang w:val="en-US"/>
+        </w:rPr>
+        <w:lastRenderedPageBreak/>
+        <w:t>You can see the date</w:t>
+      </w:r>
+    </w:p>
+    <w:p>
+      <w:pPr>
+        <w:pStyle w:val="ListParagraph"/>
+        <w:numPr>
+          <w:ilvl w:val="0"/>
+          <w:numId w:val="3"/>
+        </w:numPr>
+        <w:rPr>
+          <w:sz w:val="24"/>
+          <w:szCs w:val="24"/>
+          <w:lang w:val="en-US"/>
+        </w:rPr>
+      </w:pPr>
+      <w:r>
+        <w:rPr>
+          <w:sz w:val="24"/>
+          <w:szCs w:val="24"/>
+          <w:lang w:val="en-US"/>
+        </w:rPr>
+        <w:t>Compare search results</w:t>
+      </w:r>
+    </w:p>
+    <w:p>
+      <w:pPr>
+        <w:rPr>
+          <w:sz w:val="24"/>
+          <w:szCs w:val="24"/>
+          <w:lang w:val="en-US"/>
+        </w:rPr>
+      </w:pPr>
+    </w:p>
+    <w:p>
+      <w:pPr>
+        <w:pStyle w:val="ListParagraph"/>
+        <w:numPr>
+          <w:ilvl w:val="0"/>
+          <w:numId w:val="1"/>
+        </w:numPr>
+        <w:rPr>
+          <w:sz w:val="24"/>
+          <w:szCs w:val="24"/>
+          <w:lang w:val="en-US"/>
+        </w:rPr>
+      </w:pPr>
+      <w:r>
+        <w:rPr>
+          <w:sz w:val="24"/>
+          <w:szCs w:val="24"/>
+          <w:lang w:val="en-US"/>
+        </w:rPr>
+        <w:t>How LLMs generate responses?</w:t>
+      </w:r>
+    </w:p>
+    <w:p>
+      <w:pPr>
+        <w:pStyle w:val="ListParagraph"/>
+        <w:rPr>
+          <w:sz w:val="24"/>
+          <w:szCs w:val="24"/>
+          <w:lang w:val="en-US"/>
+        </w:rPr>
+      </w:pPr>
+      <w:r>
+        <w:rPr>
+          <w:sz w:val="24"/>
+          <w:szCs w:val="24"/>
+          <w:lang w:val="en-US"/>
+        </w:rPr>
+        <w:t>It predicts the next word.</w:t>
+      </w:r>
+      <w:r>
+        <w:rPr>
+          <w:sz w:val="24"/>
+          <w:szCs w:val="24"/>
+          <w:lang w:val="en-US"/>
+        </w:rPr>
+        <w:t xml:space="preserve"> </w:t>
+      </w:r>
+    </w:p>
+    <w:p>
+      <w:pPr>
+        <w:pStyle w:val="ListParagraph"/>
+        <w:numPr>
+          <w:ilvl w:val="0"/>
+          <w:numId w:val="2"/>
+        </w:numPr>
+        <w:rPr>
+          <w:sz w:val="24"/>
+          <w:szCs w:val="24"/>
+          <w:lang w:val="en-US"/>
+        </w:rPr>
+      </w:pPr>
+      <w:r>
+        <w:rPr>
+          <w:sz w:val="24"/>
+          <w:szCs w:val="24"/>
+          <w:lang w:val="en-US"/>
+        </w:rPr>
+        <w:t>The sun rises in the ________. “east”</w:t>
+      </w:r>
+    </w:p>
+    <w:p>
+      <w:pPr>
+        <w:pStyle w:val="ListParagraph"/>
+        <w:numPr>
+          <w:ilvl w:val="0"/>
+          <w:numId w:val="2"/>
+        </w:numPr>
+        <w:rPr>
+          <w:sz w:val="24"/>
+          <w:szCs w:val="24"/>
+          <w:lang w:val="en-US"/>
+        </w:rPr>
+      </w:pPr>
+      <w:r>
+        <w:rPr>
+          <w:sz w:val="24"/>
+          <w:szCs w:val="24"/>
+          <w:lang w:val="en-US"/>
+        </w:rPr>
+        <w:t>Roses are ________. “red”, “beautiful”</w:t>
+      </w:r>
+    </w:p>
+    <w:p>
+      <w:pPr>
+        <w:rPr>
+          <w:sz w:val="24"/>
+          <w:szCs w:val="24"/>
+          <w:lang w:val="en-US"/>
+        </w:rPr>
+      </w:pPr>
+    </w:p>
+    <w:p>
+      <w:pPr>
+        <w:pStyle w:val="ListParagraph"/>
+        <w:numPr>
+          <w:ilvl w:val="0"/>
+          <w:numId w:val="1"/>
+        </w:numPr>
+        <w:rPr>
+          <w:sz w:val="24"/>
+          <w:szCs w:val="24"/>
+          <w:lang w:val="en-US"/>
+        </w:rPr>
+      </w:pPr>
+      <w:r>
+        <w:rPr>
+          <w:sz w:val="24"/>
+          <w:szCs w:val="24"/>
+          <w:lang w:val="en-US"/>
+        </w:rPr>
+        <w:t>Does ChatGPT randomly guess words?</w:t>
+      </w:r>
+    </w:p>
+    <w:p>
+      <w:pPr>
+        <w:pStyle w:val="ListParagraph"/>
+        <w:rPr>
+          <w:sz w:val="24"/>
+          <w:szCs w:val="24"/>
+          <w:lang w:val="en-US"/>
+        </w:rPr>
+      </w:pPr>
+      <w:r>
+        <w:rPr>
+          <w:sz w:val="24"/>
+          <w:szCs w:val="24"/>
+          <w:lang w:val="en-US"/>
+        </w:rPr>
+        <w:t>It tries predicting the next word.</w:t>
+      </w:r>
+    </w:p>
+    <w:p>
+      <w:pPr>
+        <w:pStyle w:val="ListParagraph"/>
+        <w:rPr>
+          <w:sz w:val="24"/>
+          <w:szCs w:val="24"/>
+          <w:lang w:val="en-US"/>
+        </w:rPr>
+      </w:pPr>
+    </w:p>
+    <w:p>
+      <w:pPr>
+        <w:pStyle w:val="ListParagraph"/>
+        <w:rPr>
+          <w:sz w:val="24"/>
+          <w:szCs w:val="24"/>
+          <w:lang w:val="en-US"/>
+        </w:rPr>
+      </w:pPr>
+      <w:r>
+        <w:rPr>
+          <w:sz w:val="24"/>
+          <w:szCs w:val="24"/>
+          <w:lang w:val="en-US"/>
+        </w:rPr>
+        <w:t>Is an LLM just an autocomplete?</w:t>
+      </w:r>
+    </w:p>
+    <w:p>
+      <w:pPr>
+        <w:pStyle w:val="ListParagraph"/>
+        <w:rPr>
+          <w:sz w:val="24"/>
+          <w:szCs w:val="24"/>
+          <w:lang w:val="en-US"/>
+        </w:rPr>
+      </w:pPr>
+      <w:r>
+        <w:rPr>
+          <w:sz w:val="24"/>
+          <w:szCs w:val="24"/>
+          <w:lang w:val="en-US"/>
+        </w:rPr>
+        <w:t>It will be an understatement if said so.</w:t>
+      </w:r>
+    </w:p>
+    <w:p>
+      <w:pPr>
+        <w:pStyle w:val="ListParagraph"/>
+        <w:rPr>
+          <w:sz w:val="24"/>
+          <w:szCs w:val="24"/>
+          <w:lang w:val="en-US"/>
+        </w:rPr>
+      </w:pPr>
+    </w:p>
+    <w:p>
+      <w:pPr>
+        <w:pStyle w:val="ListParagraph"/>
+        <w:rPr>
+          <w:sz w:val="24"/>
+          <w:szCs w:val="24"/>
+          <w:lang w:val="en-US"/>
+        </w:rPr>
+      </w:pPr>
+      <w:r>
+        <w:rPr>
+          <w:sz w:val="24"/>
+          <w:szCs w:val="24"/>
+          <w:lang w:val="en-US"/>
+        </w:rPr>
+        <w:t>A modern LLM has a much larger context and has learned many complex patterns:</w:t>
+      </w:r>
+    </w:p>
+    <w:p>
+      <w:pPr>
+        <w:pStyle w:val="ListParagraph"/>
+        <w:numPr>
+          <w:ilvl w:val="0"/>
+          <w:numId w:val="2"/>
+        </w:numPr>
+        <w:rPr>
+          <w:sz w:val="24"/>
+          <w:szCs w:val="24"/>
+          <w:lang w:val="en-US"/>
+        </w:rPr>
+      </w:pPr>
+      <w:r>
+        <w:rPr>
+          <w:sz w:val="24"/>
+          <w:szCs w:val="24"/>
+          <w:lang w:val="en-US"/>
+        </w:rPr>
+        <w:t xml:space="preserve">Grammar </w:t>
+      </w:r>
+    </w:p>
+    <w:p>
+      <w:pPr>
+        <w:pStyle w:val="ListParagraph"/>
+        <w:numPr>
+          <w:ilvl w:val="0"/>
+          <w:numId w:val="2"/>
+        </w:numPr>
+        <w:rPr>
+          <w:sz w:val="24"/>
+          <w:szCs w:val="24"/>
+          <w:lang w:val="en-US"/>
+        </w:rPr>
+      </w:pPr>
+      <w:r>
+        <w:rPr>
+          <w:sz w:val="24"/>
+          <w:szCs w:val="24"/>
+          <w:lang w:val="en-US"/>
+        </w:rPr>
+        <w:t>Programming</w:t>
+      </w:r>
+    </w:p>
+    <w:p>
+      <w:pPr>
+        <w:pStyle w:val="ListParagraph"/>
+        <w:numPr>
+          <w:ilvl w:val="0"/>
+          <w:numId w:val="2"/>
+        </w:numPr>
+        <w:rPr>
+          <w:sz w:val="24"/>
+          <w:szCs w:val="24"/>
+          <w:lang w:val="en-US"/>
+        </w:rPr>
+      </w:pPr>
+      <w:r>
+        <w:rPr>
+          <w:sz w:val="24"/>
+          <w:szCs w:val="24"/>
+          <w:lang w:val="en-US"/>
+        </w:rPr>
+        <w:t>Reasoning</w:t>
+      </w:r>
+    </w:p>
+    <w:p>
+      <w:pPr>
+        <w:pStyle w:val="ListParagraph"/>
+        <w:numPr>
+          <w:ilvl w:val="0"/>
+          <w:numId w:val="2"/>
+        </w:numPr>
+        <w:rPr>
+          <w:sz w:val="24"/>
+          <w:szCs w:val="24"/>
+          <w:lang w:val="en-US"/>
+        </w:rPr>
+      </w:pPr>
+      <w:r>
+        <w:rPr>
+          <w:sz w:val="24"/>
+          <w:szCs w:val="24"/>
+          <w:lang w:val="en-US"/>
+        </w:rPr>
+        <w:t>Facts</w:t>
+      </w:r>
+    </w:p>
+    <w:p>
+      <w:pPr>
+        <w:pStyle w:val="ListParagraph"/>
+        <w:numPr>
+          <w:ilvl w:val="0"/>
+          <w:numId w:val="2"/>
+        </w:numPr>
+        <w:rPr>
+          <w:sz w:val="24"/>
+          <w:szCs w:val="24"/>
+          <w:lang w:val="en-US"/>
+        </w:rPr>
+      </w:pPr>
+      <w:r>
+        <w:rPr>
+          <w:sz w:val="24"/>
+          <w:szCs w:val="24"/>
+          <w:lang w:val="en-US"/>
+        </w:rPr>
+        <w:t>Language</w:t>
+      </w:r>
+    </w:p>
+    <w:p>
+      <w:pPr>
+        <w:pStyle w:val="ListParagraph"/>
+        <w:numPr>
+          <w:ilvl w:val="0"/>
+          <w:numId w:val="2"/>
+        </w:numPr>
+        <w:rPr>
+          <w:sz w:val="24"/>
+          <w:szCs w:val="24"/>
+          <w:lang w:val="en-US"/>
+        </w:rPr>
+      </w:pPr>
+      <w:r>
+        <w:rPr>
+          <w:sz w:val="24"/>
+          <w:szCs w:val="24"/>
+          <w:lang w:val="en-US"/>
+        </w:rPr>
+        <w:t>Stories</w:t>
+      </w:r>
+    </w:p>
+    <w:p>
+      <w:pPr>
+        <w:pStyle w:val="ListParagraph"/>
+        <w:numPr>
+          <w:ilvl w:val="0"/>
+          <w:numId w:val="2"/>
+        </w:numPr>
+        <w:rPr>
+          <w:sz w:val="24"/>
+          <w:szCs w:val="24"/>
+          <w:lang w:val="en-US"/>
+        </w:rPr>
+      </w:pPr>
+      <w:r>
+        <w:rPr>
+          <w:sz w:val="24"/>
+          <w:szCs w:val="24"/>
+          <w:lang w:val="en-US"/>
+        </w:rPr>
+        <w:t>Maths</w:t>
+      </w:r>
+    </w:p>
+    <w:p>
+      <w:pPr>
+        <w:pStyle w:val="ListParagraph"/>
+        <w:numPr>
+          <w:ilvl w:val="0"/>
+          <w:numId w:val="2"/>
+        </w:numPr>
+        <w:rPr>
+          <w:sz w:val="24"/>
+          <w:szCs w:val="24"/>
+          <w:lang w:val="en-US"/>
+        </w:rPr>
+      </w:pPr>
+      <w:r>
+        <w:rPr>
+          <w:sz w:val="24"/>
+          <w:szCs w:val="24"/>
+          <w:lang w:val="en-US"/>
+        </w:rPr>
+        <w:t>Association between people, places, events, ideas</w:t>
+      </w:r>
+    </w:p>
+    <w:p>
+      <w:pPr>
+        <w:rPr>
+          <w:sz w:val="24"/>
+          <w:szCs w:val="24"/>
+          <w:lang w:val="en-US"/>
+        </w:rPr>
+      </w:pPr>
+    </w:p>
+    <w:p>
+      <w:pPr>
+        <w:pStyle w:val="ListParagraph"/>
+        <w:numPr>
+          <w:ilvl w:val="0"/>
+          <w:numId w:val="1"/>
+        </w:numPr>
+        <w:rPr>
+          <w:sz w:val="24"/>
+          <w:szCs w:val="24"/>
+          <w:lang w:val="en-US"/>
+        </w:rPr>
+      </w:pPr>
+      <w:r>
+        <w:rPr>
+          <w:sz w:val="24"/>
+          <w:szCs w:val="24"/>
+          <w:lang w:val="en-US"/>
+        </w:rPr>
+        <w:t>What knowledge does LLM contains?</w:t>
+      </w:r>
+    </w:p>
+    <w:p>
+      <w:pPr>
+        <w:pStyle w:val="ListParagraph"/>
+        <w:rPr>
+          <w:sz w:val="24"/>
+          <w:szCs w:val="24"/>
+          <w:lang w:val="en-US"/>
+        </w:rPr>
+      </w:pPr>
+      <w:r>
+        <w:rPr>
+          <w:sz w:val="24"/>
+          <w:szCs w:val="24"/>
+          <w:lang w:val="en-US"/>
+        </w:rPr>
+        <w:t>A trained Neural Network contains a very large collection of numbers called parameters or weights. During training these numbers are repeatedly adjusted.</w:t>
+      </w:r>
+      <w:r>
+        <w:rPr>
+          <w:sz w:val="24"/>
+          <w:szCs w:val="24"/>
+          <w:lang w:val="en-US"/>
+        </w:rPr>
+        <w:t xml:space="preserve"> These adjustments create a pattern, so when we ask: Roses are ______. The probability of “red” to be the next word is more, than that of “beautiful”.</w:t>
+      </w:r>
+    </w:p>
+    <w:p>
+      <w:pPr>
+        <w:rPr>
+          <w:sz w:val="24"/>
+          <w:szCs w:val="24"/>
+          <w:lang w:val="en-US"/>
+        </w:rPr>
+      </w:pPr>
+    </w:p>
+    <w:p>
+      <w:pPr>
+        <w:pStyle w:val="ListParagraph"/>
+        <w:numPr>
+          <w:ilvl w:val="0"/>
+          <w:numId w:val="1"/>
+        </w:numPr>
+        <w:rPr>
+          <w:sz w:val="24"/>
+          <w:szCs w:val="24"/>
+          <w:lang w:val="en-US"/>
+        </w:rPr>
+      </w:pPr>
+      <w:r>
+        <w:rPr>
+          <w:sz w:val="24"/>
+          <w:szCs w:val="24"/>
+          <w:lang w:val="en-US"/>
+        </w:rPr>
+        <w:t>Every LLM has a knowledge cutoff date.</w:t>
+      </w:r>
+      <w:r>
+        <w:rPr>
+          <w:sz w:val="24"/>
+          <w:szCs w:val="24"/>
+          <w:lang w:val="en-US"/>
+        </w:rPr>
+        <w:t xml:space="preserve"> Neural networks are not trained everyday.</w:t>
+      </w:r>
+    </w:p>
+    <w:p>
+      <w:pPr>
+        <w:rPr>
+          <w:sz w:val="24"/>
+          <w:szCs w:val="24"/>
+          <w:lang w:val="en-US"/>
+        </w:rPr>
+      </w:pPr>
+    </w:p>
+    <w:p>
+      <w:pPr>
+        <w:pStyle w:val="ListParagraph"/>
+        <w:numPr>
+          <w:ilvl w:val="0"/>
+          <w:numId w:val="1"/>
+        </w:numPr>
+        <w:rPr>
+          <w:sz w:val="24"/>
+          <w:szCs w:val="24"/>
+          <w:lang w:val="en-US"/>
+        </w:rPr>
+      </w:pPr>
+      <w:r>
+        <w:rPr>
+          <w:sz w:val="24"/>
+          <w:szCs w:val="24"/>
+          <w:lang w:val="en-US"/>
+        </w:rPr>
+        <w:t>Every LLM is built upon a base model. The base model is trained primarily to predict the next text.</w:t>
+      </w:r>
+      <w:r>
+        <w:rPr>
+          <w:sz w:val="24"/>
+          <w:szCs w:val="24"/>
+          <w:lang w:val="en-US"/>
+        </w:rPr>
+        <w:t xml:space="preserve"> </w:t>
+      </w:r>
+    </w:p>
+    <w:p>
+      <w:pPr>
+        <w:rPr>
+          <w:sz w:val="24"/>
+          <w:szCs w:val="24"/>
+          <w:lang w:val="en-US"/>
+        </w:rPr>
+      </w:pPr>
+    </w:p>
+    <w:p>
+      <w:pPr>
+        <w:pStyle w:val="ListParagraph"/>
+        <w:numPr>
+          <w:ilvl w:val="0"/>
+          <w:numId w:val="1"/>
+        </w:numPr>
+        <w:rPr>
+          <w:sz w:val="24"/>
+          <w:szCs w:val="24"/>
+          <w:lang w:val="en-US"/>
+        </w:rPr>
+      </w:pPr>
+      <w:r>
+        <w:rPr>
+          <w:sz w:val="24"/>
+          <w:szCs w:val="24"/>
+          <w:lang w:val="en-US"/>
+        </w:rPr>
+        <w:t>ChatGPT, Gemini, Claude all these are AI assistants.</w:t>
+      </w:r>
+    </w:p>
+    <w:p>
+      <w:pPr>
+        <w:pStyle w:val="ListParagraph"/>
+        <w:rPr>
+          <w:sz w:val="24"/>
+          <w:szCs w:val="24"/>
+          <w:lang w:val="en-US"/>
+        </w:rPr>
+      </w:pPr>
+    </w:p>
+    <w:p>
+      <w:pPr>
+        <w:pStyle w:val="ListParagraph"/>
+        <w:numPr>
+          <w:ilvl w:val="0"/>
+          <w:numId w:val="1"/>
+        </w:numPr>
+        <w:rPr>
+          <w:sz w:val="24"/>
+          <w:szCs w:val="24"/>
+          <w:lang w:val="en-US"/>
+        </w:rPr>
+      </w:pPr>
+      <w:r>
+        <w:rPr>
+          <w:sz w:val="24"/>
+          <w:szCs w:val="24"/>
+          <w:lang w:val="en-US"/>
+        </w:rPr>
+        <w:t>ChatGPT is built on a base model. On top of the base models the following are adde:</w:t>
+      </w:r>
+    </w:p>
+    <w:p>
+      <w:pPr>
+        <w:pStyle w:val="ListParagraph"/>
+        <w:rPr>
+          <w:sz w:val="24"/>
+          <w:szCs w:val="24"/>
+          <w:lang w:val="en-US"/>
+        </w:rPr>
+      </w:pPr>
+    </w:p>
+    <w:p>
+      <w:pPr>
+        <w:pStyle w:val="ListParagraph"/>
+        <w:numPr>
+          <w:ilvl w:val="0"/>
+          <w:numId w:val="2"/>
+        </w:numPr>
+        <w:rPr>
+          <w:sz w:val="24"/>
+          <w:szCs w:val="24"/>
+          <w:lang w:val="en-US"/>
+        </w:rPr>
+      </w:pPr>
+      <w:r>
+        <w:rPr>
+          <w:sz w:val="24"/>
+          <w:szCs w:val="24"/>
+          <w:lang w:val="en-US"/>
+        </w:rPr>
+        <w:t>Web search</w:t>
+      </w:r>
+    </w:p>
+    <w:p>
+      <w:pPr>
+        <w:pStyle w:val="ListParagraph"/>
+        <w:numPr>
+          <w:ilvl w:val="0"/>
+          <w:numId w:val="2"/>
+        </w:numPr>
+        <w:rPr>
+          <w:sz w:val="24"/>
+          <w:szCs w:val="24"/>
+          <w:lang w:val="en-US"/>
+        </w:rPr>
+      </w:pPr>
+      <w:r>
+        <w:rPr>
+          <w:sz w:val="24"/>
+          <w:szCs w:val="24"/>
+          <w:lang w:val="en-US"/>
+        </w:rPr>
+        <w:t>Files</w:t>
+      </w:r>
+    </w:p>
+    <w:p>
+      <w:pPr>
+        <w:pStyle w:val="ListParagraph"/>
+        <w:numPr>
+          <w:ilvl w:val="0"/>
+          <w:numId w:val="2"/>
+        </w:numPr>
+        <w:rPr>
+          <w:sz w:val="24"/>
+          <w:szCs w:val="24"/>
+          <w:lang w:val="en-US"/>
+        </w:rPr>
+      </w:pPr>
+      <w:r>
+        <w:rPr>
+          <w:sz w:val="24"/>
+          <w:szCs w:val="24"/>
+          <w:lang w:val="en-US"/>
+        </w:rPr>
+        <w:t>Instruction tuning</w:t>
+      </w:r>
+    </w:p>
+    <w:p>
+      <w:pPr>
+        <w:pStyle w:val="ListParagraph"/>
+        <w:numPr>
+          <w:ilvl w:val="0"/>
+          <w:numId w:val="2"/>
+        </w:numPr>
+        <w:rPr>
+          <w:sz w:val="24"/>
+          <w:szCs w:val="24"/>
+          <w:lang w:val="en-US"/>
+        </w:rPr>
+      </w:pPr>
+      <w:r>
+        <w:rPr>
+          <w:sz w:val="24"/>
+          <w:szCs w:val="24"/>
+          <w:lang w:val="en-US"/>
+        </w:rPr>
+        <w:t>Safety training</w:t>
+      </w:r>
+    </w:p>
+    <w:p>
+      <w:pPr>
+        <w:pStyle w:val="ListParagraph"/>
+        <w:numPr>
+          <w:ilvl w:val="0"/>
+          <w:numId w:val="2"/>
+        </w:numPr>
+        <w:rPr>
+          <w:sz w:val="24"/>
+          <w:szCs w:val="24"/>
+          <w:lang w:val="en-US"/>
+        </w:rPr>
+      </w:pPr>
+      <w:r>
+        <w:rPr>
+          <w:sz w:val="24"/>
+          <w:szCs w:val="24"/>
+          <w:lang w:val="en-US"/>
+        </w:rPr>
+        <w:t>Retrieval</w:t>
+      </w:r>
+    </w:p>
+    <w:p>
+      <w:pPr>
+        <w:pStyle w:val="ListParagraph"/>
+        <w:numPr>
+          <w:ilvl w:val="0"/>
+          <w:numId w:val="2"/>
+        </w:numPr>
+        <w:rPr>
+          <w:sz w:val="24"/>
+          <w:szCs w:val="24"/>
+          <w:lang w:val="en-US"/>
+        </w:rPr>
+      </w:pPr>
+      <w:r>
+        <w:rPr>
+          <w:sz w:val="24"/>
+          <w:szCs w:val="24"/>
+          <w:lang w:val="en-US"/>
+        </w:rPr>
+        <w:t>Memory</w:t>
+      </w:r>
+    </w:p>
+    <w:p>
+      <w:pPr>
+        <w:pStyle w:val="ListParagraph"/>
+        <w:numPr>
+          <w:ilvl w:val="0"/>
+          <w:numId w:val="2"/>
+        </w:numPr>
+        <w:rPr>
+          <w:sz w:val="24"/>
+          <w:szCs w:val="24"/>
+          <w:lang w:val="en-US"/>
+        </w:rPr>
+      </w:pPr>
+      <w:r>
+        <w:rPr>
+          <w:sz w:val="24"/>
+          <w:szCs w:val="24"/>
+          <w:lang w:val="en-US"/>
+        </w:rPr>
+        <w:t>Human feedback</w:t>
+      </w:r>
+    </w:p>
+    <w:p>
+      <w:pPr>
+        <w:pStyle w:val="ListParagraph"/>
+        <w:numPr>
+          <w:ilvl w:val="0"/>
+          <w:numId w:val="2"/>
+        </w:numPr>
+        <w:rPr>
+          <w:sz w:val="24"/>
+          <w:szCs w:val="24"/>
+          <w:lang w:val="en-US"/>
+        </w:rPr>
+      </w:pPr>
+      <w:r>
+        <w:rPr>
+          <w:sz w:val="24"/>
+          <w:szCs w:val="24"/>
+          <w:lang w:val="en-US"/>
+        </w:rPr>
+        <w:t>Tools access</w:t>
+      </w:r>
+    </w:p>
+    <w:p>
+      <w:pPr>
+        <w:pStyle w:val="ListParagraph"/>
+        <w:numPr>
+          <w:ilvl w:val="0"/>
+          <w:numId w:val="2"/>
+        </w:numPr>
+        <w:rPr>
+          <w:sz w:val="24"/>
+          <w:szCs w:val="24"/>
+          <w:lang w:val="en-US"/>
+        </w:rPr>
+      </w:pPr>
+      <w:r>
+        <w:rPr>
+          <w:sz w:val="24"/>
+          <w:szCs w:val="24"/>
+          <w:lang w:val="en-US"/>
+        </w:rPr>
+        <w:t>System instructions</w:t>
+      </w:r>
+    </w:p>
+    <w:p>
+      <w:pPr>
+        <w:pStyle w:val="ListParagraph"/>
+        <w:numPr>
+          <w:ilvl w:val="0"/>
+          <w:numId w:val="2"/>
+        </w:numPr>
+        <w:rPr>
+          <w:sz w:val="24"/>
+          <w:szCs w:val="24"/>
+          <w:lang w:val="en-US"/>
+        </w:rPr>
+      </w:pPr>
+      <w:r>
+        <w:rPr>
+          <w:sz w:val="24"/>
+          <w:szCs w:val="24"/>
+          <w:lang w:val="en-US"/>
+        </w:rPr>
+        <w:t>Conversation management</w:t>
+      </w:r>
+    </w:p>
+    <w:p>
+      <w:pPr>
+        <w:pStyle w:val="ListParagraph"/>
+        <w:numPr>
+          <w:ilvl w:val="0"/>
+          <w:numId w:val="2"/>
+        </w:numPr>
+        <w:rPr>
+          <w:sz w:val="24"/>
+          <w:szCs w:val="24"/>
+          <w:lang w:val="en-US"/>
+        </w:rPr>
+      </w:pPr>
+      <w:r>
+        <w:rPr>
+          <w:sz w:val="24"/>
+          <w:szCs w:val="24"/>
+          <w:lang w:val="en-US"/>
+        </w:rPr>
+        <w:t>Security</w:t>
+      </w:r>
+    </w:p>
+    <w:p>
+      <w:pPr>
+        <w:pStyle w:val="ListParagraph"/>
+        <w:numPr>
+          <w:ilvl w:val="0"/>
+          <w:numId w:val="2"/>
+        </w:numPr>
+        <w:rPr>
+          <w:sz w:val="24"/>
+          <w:szCs w:val="24"/>
+          <w:lang w:val="en-US"/>
+        </w:rPr>
+      </w:pPr>
+      <w:r>
+        <w:rPr>
+          <w:sz w:val="24"/>
+          <w:szCs w:val="24"/>
+          <w:lang w:val="en-US"/>
+        </w:rPr>
+        <w:t>Auth</w:t>
+      </w:r>
+    </w:p>
+    <w:p>
+      <w:pPr>
+        <w:pStyle w:val="ListParagraph"/>
+        <w:numPr>
+          <w:ilvl w:val="0"/>
+          <w:numId w:val="2"/>
+        </w:numPr>
+        <w:rPr>
+          <w:sz w:val="24"/>
+          <w:szCs w:val="24"/>
+          <w:lang w:val="en-US"/>
+        </w:rPr>
+      </w:pPr>
+      <w:r>
+        <w:rPr>
+          <w:sz w:val="24"/>
+          <w:szCs w:val="24"/>
+          <w:lang w:val="en-US"/>
+        </w:rPr>
+        <w:t>Guard rails</w:t>
+      </w:r>
+    </w:p>
+    <w:p>
+      <w:pPr>
+        <w:rPr>
+          <w:sz w:val="24"/>
+          <w:szCs w:val="24"/>
+          <w:lang w:val="en-US"/>
+        </w:rPr>
+      </w:pPr>
+    </w:p>
+    <w:p>
+      <w:pPr>
+        <w:pStyle w:val="ListParagraph"/>
+        <w:numPr>
+          <w:ilvl w:val="0"/>
+          <w:numId w:val="1"/>
+        </w:numPr>
+        <w:rPr>
+          <w:sz w:val="24"/>
+          <w:szCs w:val="24"/>
+          <w:lang w:val="en-US"/>
+        </w:rPr>
+      </w:pPr>
+      <w:r>
+        <w:rPr>
+          <w:sz w:val="24"/>
+          <w:szCs w:val="24"/>
+          <w:lang w:val="en-US"/>
+        </w:rPr>
+        <w:t>Training – Take immense amounts of heavy computation through GPUs to train the models.</w:t>
+      </w:r>
+    </w:p>
+    <w:p>
+      <w:pPr>
+        <w:pStyle w:val="ListParagraph"/>
+        <w:rPr>
+          <w:sz w:val="24"/>
+          <w:szCs w:val="24"/>
+          <w:lang w:val="en-US"/>
+        </w:rPr>
+      </w:pPr>
+      <w:r>
+        <w:rPr>
+          <w:sz w:val="24"/>
+          <w:szCs w:val="24"/>
+          <w:lang w:val="en-US"/>
+        </w:rPr>
+        <w:t>Inference – Generating some response from the trained model.</w:t>
+      </w:r>
+      <w:r>
+        <w:rPr>
+          <w:sz w:val="24"/>
+          <w:szCs w:val="24"/>
+          <w:lang w:val="en-US"/>
+        </w:rPr>
+        <w:t xml:space="preserve"> It is not that heavy.</w:t>
+      </w:r>
+      <w:r>
+        <w:rPr>
+          <w:sz w:val="24"/>
+          <w:szCs w:val="24"/>
+          <w:lang w:val="en-US"/>
+        </w:rPr>
+        <w:t xml:space="preserve"> It generates information on the fly.</w:t>
+      </w:r>
+    </w:p>
+    <w:p>
+      <w:pPr>
+        <w:rPr>
+          <w:sz w:val="24"/>
+          <w:szCs w:val="24"/>
+          <w:lang w:val="en-US"/>
+        </w:rPr>
+      </w:pPr>
+    </w:p>
+    <w:p>
+      <w:pPr>
+        <w:pStyle w:val="ListParagraph"/>
+        <w:numPr>
+          <w:ilvl w:val="0"/>
+          <w:numId w:val="1"/>
+        </w:numPr>
+        <w:rPr>
+          <w:sz w:val="24"/>
+          <w:szCs w:val="24"/>
+          <w:lang w:val="en-US"/>
+        </w:rPr>
+      </w:pPr>
+      <w:r>
+        <w:rPr>
+          <w:sz w:val="24"/>
+          <w:szCs w:val="24"/>
+          <w:lang w:val="en-US"/>
+        </w:rPr>
+        <w:t>Why models confidently</w:t>
+      </w:r>
+      <w:r>
+        <w:rPr>
+          <w:sz w:val="24"/>
+          <w:szCs w:val="24"/>
+          <w:lang w:val="en-US"/>
+        </w:rPr>
+        <w:t xml:space="preserve"> produce wrong answers?</w:t>
+      </w:r>
+    </w:p>
+    <w:p>
+      <w:pPr>
+        <w:pStyle w:val="ListParagraph"/>
+        <w:rPr>
+          <w:sz w:val="24"/>
+          <w:szCs w:val="24"/>
+          <w:lang w:val="en-US"/>
+        </w:rPr>
+      </w:pPr>
+      <w:r>
+        <w:rPr>
+          <w:sz w:val="24"/>
+          <w:szCs w:val="24"/>
+          <w:lang w:val="en-US"/>
+        </w:rPr>
+        <w:t>Fake fluency != Truthfulness, this is called as “hallucination”</w:t>
+      </w:r>
+    </w:p>
+    <w:p>
+      <w:pPr>
+        <w:rPr>
+          <w:sz w:val="24"/>
+          <w:szCs w:val="24"/>
+          <w:lang w:val="en-US"/>
+        </w:rPr>
+      </w:pPr>
+    </w:p>
+    <w:p>
+      <w:pPr>
+        <w:pStyle w:val="ListParagraph"/>
+        <w:numPr>
+          <w:ilvl w:val="0"/>
+          <w:numId w:val="1"/>
+        </w:numPr>
+        <w:rPr>
+          <w:sz w:val="24"/>
+          <w:szCs w:val="24"/>
+          <w:lang w:val="en-US"/>
+        </w:rPr>
+      </w:pPr>
+      <w:r>
+        <w:rPr>
+          <w:sz w:val="24"/>
+          <w:szCs w:val="24"/>
+          <w:lang w:val="en-US"/>
+        </w:rPr>
+        <w:t>A hallucination occurs when</w:t>
+      </w:r>
+      <w:r>
+        <w:rPr>
+          <w:sz w:val="24"/>
+          <w:szCs w:val="24"/>
+          <w:lang w:val="en-US"/>
+        </w:rPr>
+        <w:t xml:space="preserve"> an AI model generates information that appears plausible but is unsupported, incorrect, misleading, or fabricated.</w:t>
+      </w:r>
+      <w:r>
+        <w:rPr>
+          <w:sz w:val="24"/>
+          <w:szCs w:val="24"/>
+          <w:lang w:val="en-US"/>
+        </w:rPr>
+        <w:t xml:space="preserve"> Language quality and factual accuracy are separate dimensions.</w:t>
+      </w:r>
+      <w:r>
+        <w:rPr>
+          <w:sz w:val="24"/>
+          <w:szCs w:val="24"/>
+          <w:lang w:val="en-US"/>
+        </w:rPr>
+        <w:t xml:space="preserve"> Confidence in language is not confidence in truth.</w:t>
+      </w:r>
+      <w:r>
+        <w:rPr>
+          <w:sz w:val="24"/>
+          <w:szCs w:val="24"/>
+          <w:lang w:val="en-US"/>
+        </w:rPr>
+        <w:t xml:space="preserve"> Never fall for “Illusion of certainty”.</w:t>
+      </w:r>
+    </w:p>
+    <w:p>
+      <w:pPr>
+        <w:rPr>
+          <w:sz w:val="24"/>
+          <w:szCs w:val="24"/>
+          <w:lang w:val="en-US"/>
+        </w:rPr>
+      </w:pPr>
+    </w:p>
+    <w:p>
+      <w:pPr>
+        <w:pStyle w:val="ListParagraph"/>
+        <w:numPr>
+          <w:ilvl w:val="0"/>
+          <w:numId w:val="1"/>
+        </w:numPr>
+        <w:rPr>
+          <w:sz w:val="24"/>
+          <w:szCs w:val="24"/>
+          <w:lang w:val="en-US"/>
+        </w:rPr>
+      </w:pPr>
+      <w:r>
+        <w:rPr>
+          <w:sz w:val="24"/>
+          <w:szCs w:val="24"/>
+          <w:lang w:val="en-US"/>
+        </w:rPr>
+        <w:t>Why does hallucinations happen?</w:t>
+      </w:r>
+    </w:p>
+    <w:p>
+      <w:pPr>
+        <w:pStyle w:val="ListParagraph"/>
+        <w:rPr>
+          <w:sz w:val="24"/>
+          <w:szCs w:val="24"/>
+          <w:lang w:val="en-US"/>
+        </w:rPr>
+      </w:pPr>
+    </w:p>
+    <w:p>
+      <w:pPr>
+        <w:pStyle w:val="ListParagraph"/>
+        <w:numPr>
+          <w:ilvl w:val="0"/>
+          <w:numId w:val="2"/>
+        </w:numPr>
+        <w:rPr>
+          <w:sz w:val="24"/>
+          <w:szCs w:val="24"/>
+          <w:lang w:val="en-US"/>
+        </w:rPr>
+      </w:pPr>
+      <w:r>
+        <w:rPr>
+          <w:sz w:val="24"/>
+          <w:szCs w:val="24"/>
+          <w:lang w:val="en-US"/>
+        </w:rPr>
+        <w:t>Insufficient information</w:t>
+      </w:r>
+    </w:p>
+    <w:p>
+      <w:pPr>
+        <w:pStyle w:val="ListParagraph"/>
+        <w:numPr>
+          <w:ilvl w:val="0"/>
+          <w:numId w:val="2"/>
+        </w:numPr>
+        <w:rPr>
+          <w:sz w:val="24"/>
+          <w:szCs w:val="24"/>
+          <w:lang w:val="en-US"/>
+        </w:rPr>
+      </w:pPr>
+      <w:r>
+        <w:rPr>
+          <w:sz w:val="24"/>
+          <w:szCs w:val="24"/>
+          <w:lang w:val="en-US"/>
+        </w:rPr>
+        <w:t>Ambiguous information</w:t>
+      </w:r>
+    </w:p>
+    <w:p>
+      <w:pPr>
+        <w:pStyle w:val="ListParagraph"/>
+        <w:numPr>
+          <w:ilvl w:val="0"/>
+          <w:numId w:val="2"/>
+        </w:numPr>
+        <w:rPr>
+          <w:sz w:val="24"/>
+          <w:szCs w:val="24"/>
+          <w:lang w:val="en-US"/>
+        </w:rPr>
+      </w:pPr>
+      <w:r>
+        <w:rPr>
+          <w:sz w:val="24"/>
+          <w:szCs w:val="24"/>
+          <w:lang w:val="en-US"/>
+        </w:rPr>
+        <w:t>Outdated knowledge</w:t>
+      </w:r>
+    </w:p>
+    <w:p>
+      <w:pPr>
+        <w:pStyle w:val="ListParagraph"/>
+        <w:numPr>
+          <w:ilvl w:val="0"/>
+          <w:numId w:val="2"/>
+        </w:numPr>
+        <w:rPr>
+          <w:sz w:val="24"/>
+          <w:szCs w:val="24"/>
+          <w:lang w:val="en-US"/>
+        </w:rPr>
+      </w:pPr>
+      <w:r>
+        <w:rPr>
+          <w:sz w:val="24"/>
+          <w:szCs w:val="24"/>
+          <w:lang w:val="en-US"/>
+        </w:rPr>
+        <w:t>False assumptions</w:t>
+      </w:r>
+    </w:p>
+    <w:p>
+      <w:pPr>
+        <w:pStyle w:val="ListParagraph"/>
+        <w:numPr>
+          <w:ilvl w:val="0"/>
+          <w:numId w:val="2"/>
+        </w:numPr>
+        <w:rPr>
+          <w:sz w:val="24"/>
+          <w:szCs w:val="24"/>
+          <w:lang w:val="en-US"/>
+        </w:rPr>
+      </w:pPr>
+      <w:r>
+        <w:rPr>
+          <w:sz w:val="24"/>
+          <w:szCs w:val="24"/>
+          <w:lang w:val="en-US"/>
+        </w:rPr>
+        <w:t>Unreliable patterns</w:t>
+      </w:r>
+    </w:p>
+    <w:p>
+      <w:pPr>
+        <w:pStyle w:val="ListParagraph"/>
+        <w:numPr>
+          <w:ilvl w:val="0"/>
+          <w:numId w:val="2"/>
+        </w:numPr>
+        <w:rPr>
+          <w:sz w:val="24"/>
+          <w:szCs w:val="24"/>
+          <w:lang w:val="en-US"/>
+        </w:rPr>
+      </w:pPr>
+      <w:r>
+        <w:rPr>
+          <w:sz w:val="24"/>
+          <w:szCs w:val="24"/>
+          <w:lang w:val="en-US"/>
+        </w:rPr>
+        <w:t>Models are optimized to answer</w:t>
+      </w:r>
+    </w:p>
+    <w:p>
+      <w:pPr>
+        <w:pStyle w:val="ListParagraph"/>
+        <w:numPr>
+          <w:ilvl w:val="0"/>
+          <w:numId w:val="2"/>
+        </w:numPr>
+        <w:rPr>
+          <w:sz w:val="24"/>
+          <w:szCs w:val="24"/>
+          <w:lang w:val="en-US"/>
+        </w:rPr>
+      </w:pPr>
+      <w:r>
+        <w:rPr>
+          <w:sz w:val="24"/>
+          <w:szCs w:val="24"/>
+          <w:lang w:val="en-US"/>
+        </w:rPr>
+        <w:t>Generation is probabilistic</w:t>
+      </w:r>
+    </w:p>
+    <w:p>
+      <w:pPr>
+        <w:rPr>
+          <w:sz w:val="24"/>
+          <w:szCs w:val="24"/>
+          <w:lang w:val="en-US"/>
+        </w:rPr>
+      </w:pPr>
+    </w:p>
+    <w:p>
+      <w:pPr>
+        <w:pStyle w:val="ListParagraph"/>
+        <w:numPr>
+          <w:ilvl w:val="0"/>
+          <w:numId w:val="1"/>
+        </w:numPr>
+        <w:rPr>
+          <w:sz w:val="24"/>
+          <w:szCs w:val="24"/>
+          <w:lang w:val="en-US"/>
+        </w:rPr>
+      </w:pPr>
+      <w:r>
+        <w:rPr>
+          <w:sz w:val="24"/>
+          <w:szCs w:val="24"/>
+          <w:lang w:val="en-US"/>
+        </w:rPr>
+        <w:t>Types of hallucinations:</w:t>
+      </w:r>
+    </w:p>
+    <w:p>
+      <w:pPr>
+        <w:pStyle w:val="ListParagraph"/>
+        <w:numPr>
+          <w:ilvl w:val="0"/>
+          <w:numId w:val="2"/>
+        </w:numPr>
+        <w:rPr>
+          <w:sz w:val="24"/>
+          <w:szCs w:val="24"/>
+          <w:lang w:val="en-US"/>
+        </w:rPr>
+      </w:pPr>
+      <w:r>
+        <w:rPr>
+          <w:sz w:val="24"/>
+          <w:szCs w:val="24"/>
+          <w:lang w:val="en-US"/>
+        </w:rPr>
+        <w:lastRenderedPageBreak/>
+        <w:t>Invented facts</w:t>
+      </w:r>
+    </w:p>
+    <w:p>
+      <w:pPr>
+        <w:pStyle w:val="ListParagraph"/>
+        <w:numPr>
+          <w:ilvl w:val="0"/>
+          <w:numId w:val="2"/>
+        </w:numPr>
+        <w:rPr>
+          <w:sz w:val="24"/>
+          <w:szCs w:val="24"/>
+          <w:lang w:val="en-US"/>
+        </w:rPr>
+      </w:pPr>
+      <w:r>
+        <w:rPr>
+          <w:sz w:val="24"/>
+          <w:szCs w:val="24"/>
+          <w:lang w:val="en-US"/>
+        </w:rPr>
+        <w:t>Invented citations</w:t>
+      </w:r>
+    </w:p>
+    <w:p>
+      <w:pPr>
+        <w:pStyle w:val="ListParagraph"/>
+        <w:numPr>
+          <w:ilvl w:val="0"/>
+          <w:numId w:val="2"/>
+        </w:numPr>
+        <w:rPr>
+          <w:sz w:val="24"/>
+          <w:szCs w:val="24"/>
+          <w:lang w:val="en-US"/>
+        </w:rPr>
+      </w:pPr>
+      <w:r>
+        <w:rPr>
+          <w:sz w:val="24"/>
+          <w:szCs w:val="24"/>
+          <w:lang w:val="en-US"/>
+        </w:rPr>
+        <w:t>Incorrect combinations</w:t>
+      </w:r>
+    </w:p>
+    <w:p>
+      <w:pPr>
+        <w:pStyle w:val="ListParagraph"/>
+        <w:numPr>
+          <w:ilvl w:val="0"/>
+          <w:numId w:val="2"/>
+        </w:numPr>
+        <w:rPr>
+          <w:sz w:val="24"/>
+          <w:szCs w:val="24"/>
+          <w:lang w:val="en-US"/>
+        </w:rPr>
+      </w:pPr>
+      <w:r>
+        <w:rPr>
+          <w:sz w:val="24"/>
+          <w:szCs w:val="24"/>
+          <w:lang w:val="en-US"/>
+        </w:rPr>
+        <w:t>Outdated facts</w:t>
+      </w:r>
+    </w:p>
+    <w:p>
+      <w:pPr>
+        <w:pStyle w:val="ListParagraph"/>
+        <w:numPr>
+          <w:ilvl w:val="0"/>
+          <w:numId w:val="2"/>
+        </w:numPr>
+        <w:rPr>
+          <w:sz w:val="24"/>
+          <w:szCs w:val="24"/>
+          <w:lang w:val="en-US"/>
+        </w:rPr>
+      </w:pPr>
+      <w:r>
+        <w:rPr>
+          <w:sz w:val="24"/>
+          <w:szCs w:val="24"/>
+          <w:lang w:val="en-US"/>
+        </w:rPr>
+        <w:t>False precision</w:t>
+      </w:r>
+    </w:p>
+    <w:p>
+      <w:pPr>
+        <w:pStyle w:val="ListParagraph"/>
+        <w:numPr>
+          <w:ilvl w:val="0"/>
+          <w:numId w:val="2"/>
+        </w:numPr>
+        <w:rPr>
+          <w:sz w:val="24"/>
+          <w:szCs w:val="24"/>
+          <w:lang w:val="en-US"/>
+        </w:rPr>
+      </w:pPr>
+      <w:r>
+        <w:rPr>
+          <w:sz w:val="24"/>
+          <w:szCs w:val="24"/>
+          <w:lang w:val="en-US"/>
+        </w:rPr>
+        <w:t>Broken reasoning</w:t>
+      </w:r>
+    </w:p>
+    <w:p>
+      <w:pPr>
+        <w:rPr>
+          <w:sz w:val="24"/>
+          <w:szCs w:val="24"/>
+          <w:lang w:val="en-US"/>
+        </w:rPr>
+      </w:pPr>
+    </w:p>
+    <w:p>
+      <w:pPr>
+        <w:pStyle w:val="ListParagraph"/>
+        <w:numPr>
+          <w:ilvl w:val="0"/>
+          <w:numId w:val="1"/>
+        </w:numPr>
+        <w:rPr>
+          <w:sz w:val="24"/>
+          <w:szCs w:val="24"/>
+          <w:lang w:val="en-US"/>
+        </w:rPr>
+      </w:pPr>
+      <w:r>
+        <w:rPr>
+          <w:sz w:val="24"/>
+          <w:szCs w:val="24"/>
+          <w:lang w:val="en-US"/>
+        </w:rPr>
+        <w:t>The confidence illusion: Humans often use tone as evidence.</w:t>
+      </w:r>
+      <w:r>
+        <w:rPr>
+          <w:sz w:val="24"/>
+          <w:szCs w:val="24"/>
+          <w:lang w:val="en-US"/>
+        </w:rPr>
+        <w:t xml:space="preserve"> </w:t>
+      </w:r>
+    </w:p>
+    <w:p>
+      <w:pPr>
+        <w:rPr>
+          <w:sz w:val="24"/>
+          <w:szCs w:val="24"/>
+          <w:lang w:val="en-US"/>
+        </w:rPr>
+      </w:pPr>
+    </w:p>
+    <w:p>
+      <w:pPr>
+        <w:pStyle w:val="ListParagraph"/>
+        <w:numPr>
+          <w:ilvl w:val="0"/>
+          <w:numId w:val="1"/>
+        </w:numPr>
+        <w:rPr>
+          <w:sz w:val="24"/>
+          <w:szCs w:val="24"/>
+          <w:lang w:val="en-US"/>
+        </w:rPr>
+      </w:pPr>
+      <w:r>
+        <w:rPr>
+          <w:sz w:val="24"/>
+          <w:szCs w:val="24"/>
+          <w:lang w:val="en-US"/>
+        </w:rPr>
+        <w:t>Web search (retrieval) + LLMs (generation)</w:t>
+      </w:r>
+    </w:p>
+    <w:p>
+      <w:pPr>
+        <w:ind w:left="720"/>
+        <w:rPr>
+          <w:sz w:val="24"/>
+          <w:szCs w:val="24"/>
+          <w:lang w:val="en-US"/>
+        </w:rPr>
+      </w:pPr>
+      <w:r>
+        <w:rPr>
+          <w:sz w:val="24"/>
+          <w:szCs w:val="24"/>
+          <w:lang w:val="en-US"/>
+        </w:rPr>
+        <w:t>Retrieval gives external evidence.</w:t>
+      </w:r>
+      <w:r>
+        <w:rPr>
+          <w:sz w:val="24"/>
+          <w:szCs w:val="24"/>
+          <w:lang w:val="en-US"/>
+        </w:rPr>
+        <w:t xml:space="preserve"> Generation converts it to useful response.</w:t>
+      </w:r>
+    </w:p>
+    <w:p>
+      <w:pPr>
+        <w:rPr>
+          <w:sz w:val="24"/>
+          <w:szCs w:val="24"/>
+          <w:lang w:val="en-US"/>
+        </w:rPr>
+      </w:pPr>
+    </w:p>
+    <w:p>
+      <w:pPr>
+        <w:pStyle w:val="ListParagraph"/>
+        <w:numPr>
+          <w:ilvl w:val="0"/>
+          <w:numId w:val="1"/>
+        </w:numPr>
+        <w:rPr>
+          <w:sz w:val="24"/>
+          <w:szCs w:val="24"/>
+          <w:lang w:val="en-US"/>
+        </w:rPr>
+      </w:pPr>
+      <w:r>
+        <w:rPr>
+          <w:sz w:val="24"/>
+          <w:szCs w:val="24"/>
+          <w:lang w:val="en-US"/>
+        </w:rPr>
+        <w:t>Are models self aware of themselves?</w:t>
+      </w:r>
+    </w:p>
+    <w:p>
+      <w:pPr>
+        <w:pStyle w:val="ListParagraph"/>
+        <w:rPr>
+          <w:sz w:val="24"/>
+          <w:szCs w:val="24"/>
+          <w:lang w:val="en-US"/>
+        </w:rPr>
+      </w:pPr>
+      <w:r>
+        <w:rPr>
+          <w:sz w:val="24"/>
+          <w:szCs w:val="24"/>
+          <w:lang w:val="en-US"/>
+        </w:rPr>
+        <w:t>No, they are not.</w:t>
+      </w:r>
+    </w:p>
+    <w:p>
+      <w:pPr>
+        <w:pStyle w:val="ListParagraph"/>
+        <w:ind w:left="1080"/>
+        <w:rPr>
+          <w:sz w:val="24"/>
+          <w:szCs w:val="24"/>
+          <w:lang w:val="en-US"/>
+        </w:rPr>
+      </w:pPr>
+    </w:p>
+    <w:p>
+      <w:pPr>
+        <w:ind w:left="720"/>
+        <w:rPr>
+          <w:sz w:val="24"/>
+          <w:szCs w:val="24"/>
+          <w:lang w:val="en-US"/>
+        </w:rPr>
+      </w:pPr>
     </w:p>
     <w:sectPr>
       <w:pgSz w:w="11906" w:h="16838"/>
@@ -237,18 +2398,18 @@
 </file>
 
 <file path=word/numbering.xml><?xml version="1.0" encoding="utf-8"?>
-<w:numbering xmlns:wpc="http://schemas.microsoft.com/office/word/2010/wordprocessingCanvas" xmlns:cx="http://schemas.microsoft.com/office/drawing/2014/chartex" xmlns:cx1="http://schemas.microsoft.com/office/drawing/2015/9/8/chartex" xmlns:cx2="http://schemas.microsoft.com/office/drawing/2015/10/21/chartex" xmlns:cx3="http://schemas.microsoft.com/office/drawing/2016/5/9/chartex" xmlns:cx4="http://schemas.microsoft.com/office/drawing/2016/5/10/chartex" xmlns:cx5="http://schemas.microsoft.com/office/drawing/2016/5/11/chartex" xmlns:cx6="http://schemas.microsoft.com/office/drawing/2016/5/12/chartex" xmlns:cx7="http://schemas.microsoft.com/office/drawing/2016/5/13/chartex" xmlns:cx8="http://schemas.microsoft.com/office/drawing/2016/5/14/chartex" xmlns:mc="http://schemas.openxmlformats.org/markup-compatibility/2006" xmlns:aink="http://schemas.microsoft.com/office/drawing/2016/ink" xmlns:am3d="http://schemas.microsoft.com/office/drawing/2017/model3d" xmlns:o="urn:schemas-microsoft-com:office:office" xmlns:oel="http://schemas.microsoft.com/office/2019/extlst" xmlns:r="http://schemas.openxmlformats.org/officeDocument/2006/relationships" xmlns:m="http://schemas.openxmlformats.org/officeDocument/2006/math" xmlns:v="urn:schemas-microsoft-com:vml" xmlns:wp14="http://schemas.microsoft.com/office/word/2010/wordprocessingDrawing" xmlns:wp="http://schemas.openxmlformats.org/drawingml/2006/wordprocessingDrawing" xmlns:w10="urn:schemas-microsoft-com:office:word" xmlns:w="http://schemas.openxmlformats.org/wordprocessingml/2006/main" xmlns:w14="http://schemas.microsoft.com/office/word/2010/wordml" xmlns:w15="http://schemas.microsoft.com/office/word/2012/wordml" xmlns:w16cei="http://schemas.microsoft.com/office/word/2026/wordml/cei" xmlns:w16cex="http://schemas.microsoft.com/office/word/2018/wordml/cex" xmlns:w16cid="http://schemas.microsoft.com/office/word/2016/wordml/cid" xmlns:w16="http://schemas.microsoft.com/office/word/2018/wordml" xmlns:w16du="http://schemas.microsoft.com/office/word/2023/wordml/word16du" xmlns:w16sdtdh="http://schemas.microsoft.com/office/word/2020/wordml/sdtdatahash" xmlns:w16sdtfl="http://schemas.microsoft.com/office/word/2024/wordml/sdtformatlock" xmlns:w16se="http://schemas.microsoft.com/office/word/2015/wordml/symex" xmlns:wpg="http://schemas.microsoft.com/office/word/2010/wordprocessingGroup" xmlns:wpi="http://schemas.microsoft.com/office/word/2010/wordprocessingInk" xmlns:wne="http://schemas.microsoft.com/office/word/2006/wordml" xmlns:wps="http://schemas.microsoft.com/office/word/2010/wordprocessingShape" mc:Ignorable="w14 w15 w16se w16cid w16 w16cex w16sdtdh w16sdtfl w16du wp14">
+<w:numbering xmlns:wpc="http://schemas.microsoft.com/office/word/2010/wordprocessingCanvas" xmlns:cx="http://schemas.microsoft.com/office/drawing/2014/chartex" xmlns:cx1="http://schemas.microsoft.com/office/drawing/2015/9/8/chartex" xmlns:cx2="http://schemas.microsoft.com/office/drawing/2015/10/21/chartex" xmlns:cx3="http://schemas.microsoft.com/office/drawing/2016/5/9/chartex" xmlns:cx4="http://schemas.microsoft.com/office/drawing/2016/5/10/chartex" xmlns:cx5="http://schemas.microsoft.com/office/drawing/2016/5/11/chartex" xmlns:cx6="http://schemas.microsoft.com/office/drawing/2016/5/12/chartex" xmlns:cx7="http://schemas.microsoft.com/office/drawing/2016/5/13/chartex" xmlns:cx8="http://schemas.microsoft.com/office/drawing/2016/5/14/chartex" xmlns:mc="http://schemas.openxmlformats.org/markup-compatibility/2006" xmlns:aink="http://schemas.microsoft.com/office/drawing/2016/ink" xmlns:am3d="http://schemas.microsoft.com/office/drawing/2017/model3d" xmlns:o="urn:schemas-microsoft-com:office:office" xmlns:oel="http://schemas.microsoft.com/office/2019/extlst" xmlns:r="http://schemas.openxmlformats.org/officeDocument/2006/relationships" xmlns:m="http://schemas.openxmlformats.org/officeDocument/2006/math" xmlns:v="urn:schemas-microsoft-com:vml" xmlns:wp14="http://schemas.microsoft.com/office/word/2010/wordprocessingDrawing" xmlns:wp="http://schemas.openxmlformats.org/drawingml/2006/wordprocessingDrawing" xmlns:w10="urn:schemas-microsoft-com:office:word" xmlns:w="http://schemas.openxmlformats.org/wordprocessingml/2006/main" xmlns:w14="http://schemas.microsoft.com/office/word/2010/wordml" xmlns:w15="http://schemas.microsoft.com/office/word/2012/wordml" xmlns:w16cex="http://schemas.microsoft.com/office/word/2018/wordml/cex" xmlns:w16cid="http://schemas.microsoft.com/office/word/2016/wordml/cid" xmlns:w16="http://schemas.microsoft.com/office/word/2018/wordml" xmlns:w16du="http://schemas.microsoft.com/office/word/2023/wordml/word16du" xmlns:w16sdtdh="http://schemas.microsoft.com/office/word/2020/wordml/sdtdatahash" xmlns:w16sdtfl="http://schemas.microsoft.com/office/word/2024/wordml/sdtformatlock" xmlns:w16se="http://schemas.microsoft.com/office/word/2015/wordml/symex" xmlns:wpg="http://schemas.microsoft.com/office/word/2010/wordprocessingGroup" xmlns:wpi="http://schemas.microsoft.com/office/word/2010/wordprocessingInk" xmlns:wne="http://schemas.microsoft.com/office/word/2006/wordml" xmlns:wps="http://schemas.microsoft.com/office/word/2010/wordprocessingShape" mc:Ignorable="w14 w15 w16se w16cid w16 w16cex w16sdtdh w16sdtfl w16du wp14">
   <w:abstractNum w:abstractNumId="0" w15:restartNumberingAfterBreak="0">
-    <w:nsid w:val="489D70D2"/>
+    <w:nsid w:val="1DEB76FB"/>
     <w:multiLevelType w:val="hybridMultilevel"/>
-    <w:tmpl w:val="E9DA1294"/>
-    <w:lvl w:ilvl="0" w:tplc="40090011">
+    <w:tmpl w:val="A8F448A2"/>
+    <w:lvl w:ilvl="0" w:tplc="8AF69A0E">
       <w:start w:val="1"/>
-      <w:numFmt w:val="decimal"/>
-      <w:lvlText w:val="%1)"/>
+      <w:numFmt w:val="lowerLetter"/>
+      <w:lvlText w:val="%1."/>
       <w:lvlJc w:val="left"/>
       <w:pPr>
-        <w:ind w:left="720" w:hanging="360"/>
+        <w:ind w:left="1080" w:hanging="360"/>
       </w:pPr>
       <w:rPr>
         <w:rFonts w:hint="default"/>
@@ -260,7 +2421,7 @@
       <w:lvlText w:val="%2."/>
       <w:lvlJc w:val="left"/>
       <w:pPr>
-        <w:ind w:left="1440" w:hanging="360"/>
+        <w:ind w:left="1800" w:hanging="360"/>
       </w:pPr>
     </w:lvl>
     <w:lvl w:ilvl="2" w:tplc="4009001B" w:tentative="1">
@@ -269,7 +2430,7 @@
       <w:lvlText w:val="%3."/>
       <w:lvlJc w:val="right"/>
       <w:pPr>
-        <w:ind w:left="2160" w:hanging="180"/>
+        <w:ind w:left="2520" w:hanging="180"/>
       </w:pPr>
     </w:lvl>
     <w:lvl w:ilvl="3" w:tplc="4009000F" w:tentative="1">
@@ -278,7 +2439,7 @@
       <w:lvlText w:val="%4."/>
       <w:lvlJc w:val="left"/>
       <w:pPr>
-        <w:ind w:left="2880" w:hanging="360"/>
+        <w:ind w:left="3240" w:hanging="360"/>
       </w:pPr>
     </w:lvl>
     <w:lvl w:ilvl="4" w:tplc="40090019" w:tentative="1">
@@ -287,7 +2448,7 @@
       <w:lvlText w:val="%5."/>
       <w:lvlJc w:val="left"/>
       <w:pPr>
-        <w:ind w:left="3600" w:hanging="360"/>
+        <w:ind w:left="3960" w:hanging="360"/>
       </w:pPr>
     </w:lvl>
     <w:lvl w:ilvl="5" w:tplc="4009001B" w:tentative="1">
@@ -296,7 +2457,7 @@
       <w:lvlText w:val="%6."/>
       <w:lvlJc w:val="right"/>
       <w:pPr>
-        <w:ind w:left="4320" w:hanging="180"/>
+        <w:ind w:left="4680" w:hanging="180"/>
       </w:pPr>
     </w:lvl>
     <w:lvl w:ilvl="6" w:tplc="4009000F" w:tentative="1">
@@ -305,7 +2466,7 @@
       <w:lvlText w:val="%7."/>
       <w:lvlJc w:val="left"/>
       <w:pPr>
-        <w:ind w:left="5040" w:hanging="360"/>
+        <w:ind w:left="5400" w:hanging="360"/>
       </w:pPr>
     </w:lvl>
     <w:lvl w:ilvl="7" w:tplc="40090019" w:tentative="1">
@@ -314,7 +2475,7 @@
       <w:lvlText w:val="%8."/>
       <w:lvlJc w:val="left"/>
       <w:pPr>
-        <w:ind w:left="5760" w:hanging="360"/>
+        <w:ind w:left="6120" w:hanging="360"/>
       </w:pPr>
     </w:lvl>
     <w:lvl w:ilvl="8" w:tplc="4009001B" w:tentative="1">
@@ -323,11 +2484,219 @@
       <w:lvlText w:val="%9."/>
       <w:lvlJc w:val="right"/>
       <w:pPr>
+        <w:ind w:left="6840" w:hanging="180"/>
+      </w:pPr>
+    </w:lvl>
+  </w:abstractNum>
+  <w:abstractNum w:abstractNumId="1" w15:restartNumberingAfterBreak="0">
+    <w:nsid w:val="20225FB8"/>
+    <w:multiLevelType w:val="hybridMultilevel"/>
+    <w:tmpl w:val="9336E118"/>
+    <w:lvl w:ilvl="0" w:tplc="24EE0860">
+      <w:start w:val="4"/>
+      <w:numFmt w:val="bullet"/>
+      <w:lvlText w:val="-"/>
+      <w:lvlJc w:val="left"/>
+      <w:pPr>
+        <w:ind w:left="1080" w:hanging="360"/>
+      </w:pPr>
+      <w:rPr>
+        <w:rFonts w:ascii="Calibri" w:eastAsiaTheme="minorHAnsi" w:hAnsi="Calibri" w:cs="Calibri" w:hint="default"/>
+      </w:rPr>
+    </w:lvl>
+    <w:lvl w:ilvl="1" w:tplc="40090003" w:tentative="1">
+      <w:start w:val="1"/>
+      <w:numFmt w:val="bullet"/>
+      <w:lvlText w:val="o"/>
+      <w:lvlJc w:val="left"/>
+      <w:pPr>
+        <w:ind w:left="1800" w:hanging="360"/>
+      </w:pPr>
+      <w:rPr>
+        <w:rFonts w:ascii="Courier New" w:hAnsi="Courier New" w:cs="Courier New" w:hint="default"/>
+      </w:rPr>
+    </w:lvl>
+    <w:lvl w:ilvl="2" w:tplc="40090005" w:tentative="1">
+      <w:start w:val="1"/>
+      <w:numFmt w:val="bullet"/>
+      <w:lvlText w:val=""/>
+      <w:lvlJc w:val="left"/>
+      <w:pPr>
+        <w:ind w:left="2520" w:hanging="360"/>
+      </w:pPr>
+      <w:rPr>
+        <w:rFonts w:ascii="Wingdings" w:hAnsi="Wingdings" w:hint="default"/>
+      </w:rPr>
+    </w:lvl>
+    <w:lvl w:ilvl="3" w:tplc="40090001" w:tentative="1">
+      <w:start w:val="1"/>
+      <w:numFmt w:val="bullet"/>
+      <w:lvlText w:val=""/>
+      <w:lvlJc w:val="left"/>
+      <w:pPr>
+        <w:ind w:left="3240" w:hanging="360"/>
+      </w:pPr>
+      <w:rPr>
+        <w:rFonts w:ascii="Symbol" w:hAnsi="Symbol" w:hint="default"/>
+      </w:rPr>
+    </w:lvl>
+    <w:lvl w:ilvl="4" w:tplc="40090003" w:tentative="1">
+      <w:start w:val="1"/>
+      <w:numFmt w:val="bullet"/>
+      <w:lvlText w:val="o"/>
+      <w:lvlJc w:val="left"/>
+      <w:pPr>
+        <w:ind w:left="3960" w:hanging="360"/>
+      </w:pPr>
+      <w:rPr>
+        <w:rFonts w:ascii="Courier New" w:hAnsi="Courier New" w:cs="Courier New" w:hint="default"/>
+      </w:rPr>
+    </w:lvl>
+    <w:lvl w:ilvl="5" w:tplc="40090005" w:tentative="1">
+      <w:start w:val="1"/>
+      <w:numFmt w:val="bullet"/>
+      <w:lvlText w:val=""/>
+      <w:lvlJc w:val="left"/>
+      <w:pPr>
+        <w:ind w:left="4680" w:hanging="360"/>
+      </w:pPr>
+      <w:rPr>
+        <w:rFonts w:ascii="Wingdings" w:hAnsi="Wingdings" w:hint="default"/>
+      </w:rPr>
+    </w:lvl>
+    <w:lvl w:ilvl="6" w:tplc="40090001" w:tentative="1">
+      <w:start w:val="1"/>
+      <w:numFmt w:val="bullet"/>
+      <w:lvlText w:val=""/>
+      <w:lvlJc w:val="left"/>
+      <w:pPr>
+        <w:ind w:left="5400" w:hanging="360"/>
+      </w:pPr>
+      <w:rPr>
+        <w:rFonts w:ascii="Symbol" w:hAnsi="Symbol" w:hint="default"/>
+      </w:rPr>
+    </w:lvl>
+    <w:lvl w:ilvl="7" w:tplc="40090003" w:tentative="1">
+      <w:start w:val="1"/>
+      <w:numFmt w:val="bullet"/>
+      <w:lvlText w:val="o"/>
+      <w:lvlJc w:val="left"/>
+      <w:pPr>
+        <w:ind w:left="6120" w:hanging="360"/>
+      </w:pPr>
+      <w:rPr>
+        <w:rFonts w:ascii="Courier New" w:hAnsi="Courier New" w:cs="Courier New" w:hint="default"/>
+      </w:rPr>
+    </w:lvl>
+    <w:lvl w:ilvl="8" w:tplc="40090005" w:tentative="1">
+      <w:start w:val="1"/>
+      <w:numFmt w:val="bullet"/>
+      <w:lvlText w:val=""/>
+      <w:lvlJc w:val="left"/>
+      <w:pPr>
+        <w:ind w:left="6840" w:hanging="360"/>
+      </w:pPr>
+      <w:rPr>
+        <w:rFonts w:ascii="Wingdings" w:hAnsi="Wingdings" w:hint="default"/>
+      </w:rPr>
+    </w:lvl>
+  </w:abstractNum>
+  <w:abstractNum w:abstractNumId="2" w15:restartNumberingAfterBreak="0">
+    <w:nsid w:val="489D70D2"/>
+    <w:multiLevelType w:val="hybridMultilevel"/>
+    <w:tmpl w:val="E9DA1294"/>
+    <w:lvl w:ilvl="0" w:tplc="40090011">
+      <w:start w:val="1"/>
+      <w:numFmt w:val="decimal"/>
+      <w:lvlText w:val="%1)"/>
+      <w:lvlJc w:val="left"/>
+      <w:pPr>
+        <w:ind w:left="720" w:hanging="360"/>
+      </w:pPr>
+      <w:rPr>
+        <w:rFonts w:hint="default"/>
+      </w:rPr>
+    </w:lvl>
+    <w:lvl w:ilvl="1" w:tplc="40090019">
+      <w:start w:val="1"/>
+      <w:numFmt w:val="lowerLetter"/>
+      <w:lvlText w:val="%2."/>
+      <w:lvlJc w:val="left"/>
+      <w:pPr>
+        <w:ind w:left="1440" w:hanging="360"/>
+      </w:pPr>
+    </w:lvl>
+    <w:lvl w:ilvl="2" w:tplc="4009001B" w:tentative="1">
+      <w:start w:val="1"/>
+      <w:numFmt w:val="lowerRoman"/>
+      <w:lvlText w:val="%3."/>
+      <w:lvlJc w:val="right"/>
+      <w:pPr>
+        <w:ind w:left="2160" w:hanging="180"/>
+      </w:pPr>
+    </w:lvl>
+    <w:lvl w:ilvl="3" w:tplc="4009000F" w:tentative="1">
+      <w:start w:val="1"/>
+      <w:numFmt w:val="decimal"/>
+      <w:lvlText w:val="%4."/>
+      <w:lvlJc w:val="left"/>
+      <w:pPr>
+        <w:ind w:left="2880" w:hanging="360"/>
+      </w:pPr>
+    </w:lvl>
+    <w:lvl w:ilvl="4" w:tplc="40090019" w:tentative="1">
+      <w:start w:val="1"/>
+      <w:numFmt w:val="lowerLetter"/>
+      <w:lvlText w:val="%5."/>
+      <w:lvlJc w:val="left"/>
+      <w:pPr>
+        <w:ind w:left="3600" w:hanging="360"/>
+      </w:pPr>
+    </w:lvl>
+    <w:lvl w:ilvl="5" w:tplc="4009001B" w:tentative="1">
+      <w:start w:val="1"/>
+      <w:numFmt w:val="lowerRoman"/>
+      <w:lvlText w:val="%6."/>
+      <w:lvlJc w:val="right"/>
+      <w:pPr>
+        <w:ind w:left="4320" w:hanging="180"/>
+      </w:pPr>
+    </w:lvl>
+    <w:lvl w:ilvl="6" w:tplc="4009000F" w:tentative="1">
+      <w:start w:val="1"/>
+      <w:numFmt w:val="decimal"/>
+      <w:lvlText w:val="%7."/>
+      <w:lvlJc w:val="left"/>
+      <w:pPr>
+        <w:ind w:left="5040" w:hanging="360"/>
+      </w:pPr>
+    </w:lvl>
+    <w:lvl w:ilvl="7" w:tplc="40090019" w:tentative="1">
+      <w:start w:val="1"/>
+      <w:numFmt w:val="lowerLetter"/>
+      <w:lvlText w:val="%8."/>
+      <w:lvlJc w:val="left"/>
+      <w:pPr>
+        <w:ind w:left="5760" w:hanging="360"/>
+      </w:pPr>
+    </w:lvl>
+    <w:lvl w:ilvl="8" w:tplc="4009001B" w:tentative="1">
+      <w:start w:val="1"/>
+      <w:numFmt w:val="lowerRoman"/>
+      <w:lvlText w:val="%9."/>
+      <w:lvlJc w:val="right"/>
+      <w:pPr>
         <w:ind w:left="6480" w:hanging="180"/>
       </w:pPr>
     </w:lvl>
   </w:abstractNum>
   <w:num w:numId="1" w16cid:durableId="893273478">
+    <w:abstractNumId w:val="2"/>
+  </w:num>
+  <w:num w:numId="2" w16cid:durableId="889269574">
+    <w:abstractNumId w:val="1"/>
+  </w:num>
+  <w:num w:numId="3" w16cid:durableId="1648122080">
     <w:abstractNumId w:val="0"/>
   </w:num>
 </w:numbering>

</xml_diff>

<commit_message>
Episode_4: The Secret Language of LLMs
</commit_message>
<xml_diff>
--- a/AI/Episode_3/DoesChatGPTKnowOrItGuess.docx
+++ b/AI/Episode_3/DoesChatGPTKnowOrItGuess.docx
@@ -1152,6 +1152,7 @@
           <w:lang w:val="en-US"/>
         </w:rPr>
       </w:pPr>
+      <w:proofErr w:type="spellStart"/>
       <w:r>
         <w:rPr>
           <w:sz w:val="24"/>
@@ -1160,6 +1161,7 @@
         </w:rPr>
         <w:t>Maths</w:t>
       </w:r>
+      <w:proofErr w:type="spellEnd"/>
     </w:p>
     <w:p>
       <w:pPr>
@@ -1276,7 +1278,25 @@
           <w:szCs w:val="24"/>
           <w:lang w:val="en-US"/>
         </w:rPr>
-        <w:t xml:space="preserve"> Neural networks are not trained everyday.</w:t>
+        <w:t xml:space="preserve"> Neural networks are not trained </w:t>
+      </w:r>
+      <w:proofErr w:type="spellStart"/>
+      <w:r>
+        <w:rPr>
+          <w:sz w:val="24"/>
+          <w:szCs w:val="24"/>
+          <w:lang w:val="en-US"/>
+        </w:rPr>
+        <w:t>everyday</w:t>
+      </w:r>
+      <w:proofErr w:type="spellEnd"/>
+      <w:r>
+        <w:rPr>
+          <w:sz w:val="24"/>
+          <w:szCs w:val="24"/>
+          <w:lang w:val="en-US"/>
+        </w:rPr>
+        <w:t>.</w:t>
       </w:r>
     </w:p>
     <w:p>
@@ -1378,7 +1398,40 @@
           <w:szCs w:val="24"/>
           <w:lang w:val="en-US"/>
         </w:rPr>
-        <w:t>ChatGPT is built on a base model. On top of the base models the following are adde:</w:t>
+        <w:lastRenderedPageBreak/>
+        <w:t>ChatGPT is built on</w:t>
+      </w:r>
+      <w:r>
+        <w:rPr>
+          <w:sz w:val="24"/>
+          <w:szCs w:val="24"/>
+          <w:lang w:val="en-US"/>
+        </w:rPr>
+        <w:t xml:space="preserve"> top of</w:t>
+      </w:r>
+      <w:r>
+        <w:rPr>
+          <w:sz w:val="24"/>
+          <w:szCs w:val="24"/>
+          <w:lang w:val="en-US"/>
+        </w:rPr>
+        <w:t xml:space="preserve"> a base model. On top of the base models the following are adde</w:t>
+      </w:r>
+      <w:r>
+        <w:rPr>
+          <w:sz w:val="24"/>
+          <w:szCs w:val="24"/>
+          <w:lang w:val="en-US"/>
+        </w:rPr>
+        <w:t>d</w:t>
+      </w:r>
+      <w:r>
+        <w:rPr>
+          <w:sz w:val="24"/>
+          <w:szCs w:val="24"/>
+          <w:lang w:val="en-US"/>
+        </w:rPr>
+        <w:t>:</w:t>
       </w:r>
     </w:p>
     <w:p>
@@ -2107,7 +2160,6 @@
           <w:szCs w:val="24"/>
           <w:lang w:val="en-US"/>
         </w:rPr>
-        <w:lastRenderedPageBreak/>
         <w:t>Invented facts</w:t>
       </w:r>
     </w:p>
@@ -2345,7 +2397,25 @@
           <w:szCs w:val="24"/>
           <w:lang w:val="en-US"/>
         </w:rPr>
-        <w:t>Are models self aware of themselves?</w:t>
+        <w:t xml:space="preserve">Are models </w:t>
+      </w:r>
+      <w:proofErr w:type="spellStart"/>
+      <w:r>
+        <w:rPr>
+          <w:sz w:val="24"/>
+          <w:szCs w:val="24"/>
+          <w:lang w:val="en-US"/>
+        </w:rPr>
+        <w:t>self aware</w:t>
+      </w:r>
+      <w:proofErr w:type="spellEnd"/>
+      <w:r>
+        <w:rPr>
+          <w:sz w:val="24"/>
+          <w:szCs w:val="24"/>
+          <w:lang w:val="en-US"/>
+        </w:rPr>
+        <w:t xml:space="preserve"> of themselves?</w:t>
       </w:r>
     </w:p>
     <w:p>

</xml_diff>